<commit_message>
added new release notes
</commit_message>
<xml_diff>
--- a/assets/release_notes/originals/Release Notes - Original.docx
+++ b/assets/release_notes/originals/Release Notes - Original.docx
@@ -10,48 +10,267 @@
           <w:numId w:val="10"/>
         </w:numPr>
         <w:spacing w:line="360" w:lineRule="auto"/>
-      </w:pPr>
-      <w:fldSimple w:instr=" MERGEFIELD &quot;Area_Level_2&quot; ">
-        <w:r>
-          <w:rPr>
-            <w:noProof/>
-          </w:rPr>
-          <w:t>PDH Technology</w:t>
-        </w:r>
-      </w:fldSimple>
-      <w:r>
-        <w:t xml:space="preserve"> / </w:t>
-      </w:r>
-      <w:fldSimple w:instr=" MERGEFIELD &quot;Epic_Title&quot; ">
-        <w:r>
-          <w:rPr>
-            <w:noProof/>
-          </w:rPr>
-          <w:t>Non-Dev</w:t>
-        </w:r>
-      </w:fldSimple>
-      <w:r>
-        <w:t xml:space="preserve"> / </w:t>
-      </w:r>
-      <w:fldSimple w:instr=" MERGEFIELD &quot;Feature_Title&quot; ">
-        <w:r>
-          <w:rPr>
-            <w:noProof/>
-          </w:rPr>
-          <w:t>Non-Dev</w:t>
-        </w:r>
-      </w:fldSimple>
-      <w:r>
-        <w:t xml:space="preserve"> / </w:t>
-      </w:r>
-      <w:fldSimple w:instr=" MERGEFIELD &quot;Work_Item_Title&quot; ">
-        <w:r>
-          <w:rPr>
-            <w:noProof/>
-          </w:rPr>
-          <w:t>Add Philhenning V1 to Azure DevOps Boards</w:t>
-        </w:r>
-      </w:fldSimple>
+        <w:rPr>
+          <w:b/>
+          <w:bCs/>
+          <w:i/>
+          <w:iCs/>
+          <w:color w:val="0F4761" w:themeColor="accent1" w:themeShade="BF"/>
+        </w:rPr>
+      </w:pPr>
+      <w:r>
+        <w:rPr>
+          <w:i/>
+          <w:iCs/>
+          <w:color w:val="0F4761" w:themeColor="accent1" w:themeShade="BF"/>
+        </w:rPr>
+        <w:fldChar w:fldCharType="begin"/>
+      </w:r>
+      <w:r>
+        <w:rPr>
+          <w:i/>
+          <w:iCs/>
+          <w:color w:val="0F4761" w:themeColor="accent1" w:themeShade="BF"/>
+        </w:rPr>
+        <w:instrText xml:space="preserve"> MERGEFIELD Project </w:instrText>
+      </w:r>
+      <w:r>
+        <w:rPr>
+          <w:i/>
+          <w:iCs/>
+          <w:color w:val="0F4761" w:themeColor="accent1" w:themeShade="BF"/>
+        </w:rPr>
+        <w:fldChar w:fldCharType="separate"/>
+      </w:r>
+      <w:r>
+        <w:rPr>
+          <w:i/>
+          <w:iCs/>
+          <w:noProof/>
+          <w:color w:val="0F4761" w:themeColor="accent1" w:themeShade="BF"/>
+        </w:rPr>
+        <w:t>PDH Technology</w:t>
+      </w:r>
+      <w:r>
+        <w:rPr>
+          <w:i/>
+          <w:iCs/>
+          <w:color w:val="0F4761" w:themeColor="accent1" w:themeShade="BF"/>
+        </w:rPr>
+        <w:fldChar w:fldCharType="end"/>
+      </w:r>
+      <w:r>
+        <w:rPr>
+          <w:i/>
+          <w:iCs/>
+          <w:noProof/>
+          <w:color w:val="0F4761" w:themeColor="accent1" w:themeShade="BF"/>
+        </w:rPr>
+        <w:t xml:space="preserve"> </w:t>
+      </w:r>
+      <w:r>
+        <w:rPr>
+          <w:i/>
+          <w:iCs/>
+          <w:noProof/>
+          <w:color w:val="0F4761" w:themeColor="accent1" w:themeShade="BF"/>
+        </w:rPr>
+        <w:t>&gt;</w:t>
+      </w:r>
+      <w:r>
+        <w:rPr>
+          <w:i/>
+          <w:iCs/>
+          <w:noProof/>
+          <w:color w:val="0F4761" w:themeColor="accent1" w:themeShade="BF"/>
+        </w:rPr>
+        <w:t xml:space="preserve"> </w:t>
+      </w:r>
+      <w:r>
+        <w:rPr>
+          <w:i/>
+          <w:iCs/>
+          <w:color w:val="0F4761" w:themeColor="accent1" w:themeShade="BF"/>
+        </w:rPr>
+        <w:fldChar w:fldCharType="begin"/>
+      </w:r>
+      <w:r>
+        <w:rPr>
+          <w:i/>
+          <w:iCs/>
+          <w:color w:val="0F4761" w:themeColor="accent1" w:themeShade="BF"/>
+        </w:rPr>
+        <w:instrText xml:space="preserve"> MERGEFIELD "Epic_Title" </w:instrText>
+      </w:r>
+      <w:r>
+        <w:rPr>
+          <w:i/>
+          <w:iCs/>
+          <w:color w:val="0F4761" w:themeColor="accent1" w:themeShade="BF"/>
+        </w:rPr>
+        <w:fldChar w:fldCharType="separate"/>
+      </w:r>
+      <w:r>
+        <w:rPr>
+          <w:i/>
+          <w:iCs/>
+          <w:noProof/>
+          <w:color w:val="0F4761" w:themeColor="accent1" w:themeShade="BF"/>
+        </w:rPr>
+        <w:t>Non-Dev</w:t>
+      </w:r>
+      <w:r>
+        <w:rPr>
+          <w:i/>
+          <w:iCs/>
+          <w:noProof/>
+          <w:color w:val="0F4761" w:themeColor="accent1" w:themeShade="BF"/>
+        </w:rPr>
+        <w:fldChar w:fldCharType="end"/>
+      </w:r>
+      <w:r>
+        <w:rPr>
+          <w:i/>
+          <w:iCs/>
+          <w:noProof/>
+          <w:color w:val="0F4761" w:themeColor="accent1" w:themeShade="BF"/>
+        </w:rPr>
+        <w:t xml:space="preserve"> </w:t>
+      </w:r>
+      <w:r>
+        <w:rPr>
+          <w:i/>
+          <w:iCs/>
+          <w:noProof/>
+          <w:color w:val="0F4761" w:themeColor="accent1" w:themeShade="BF"/>
+        </w:rPr>
+        <w:t>&gt;</w:t>
+      </w:r>
+      <w:r>
+        <w:rPr>
+          <w:i/>
+          <w:iCs/>
+          <w:noProof/>
+          <w:color w:val="0F4761" w:themeColor="accent1" w:themeShade="BF"/>
+        </w:rPr>
+        <w:t xml:space="preserve"> </w:t>
+      </w:r>
+      <w:r>
+        <w:rPr>
+          <w:i/>
+          <w:iCs/>
+          <w:color w:val="0F4761" w:themeColor="accent1" w:themeShade="BF"/>
+        </w:rPr>
+        <w:fldChar w:fldCharType="begin"/>
+      </w:r>
+      <w:r>
+        <w:rPr>
+          <w:i/>
+          <w:iCs/>
+          <w:color w:val="0F4761" w:themeColor="accent1" w:themeShade="BF"/>
+        </w:rPr>
+        <w:instrText xml:space="preserve"> MERGEFIELD "Feature_Title" </w:instrText>
+      </w:r>
+      <w:r>
+        <w:rPr>
+          <w:i/>
+          <w:iCs/>
+          <w:color w:val="0F4761" w:themeColor="accent1" w:themeShade="BF"/>
+        </w:rPr>
+        <w:fldChar w:fldCharType="separate"/>
+      </w:r>
+      <w:r>
+        <w:rPr>
+          <w:i/>
+          <w:iCs/>
+          <w:noProof/>
+          <w:color w:val="0F4761" w:themeColor="accent1" w:themeShade="BF"/>
+        </w:rPr>
+        <w:t>Non-Dev</w:t>
+      </w:r>
+      <w:r>
+        <w:rPr>
+          <w:i/>
+          <w:iCs/>
+          <w:noProof/>
+          <w:color w:val="0F4761" w:themeColor="accent1" w:themeShade="BF"/>
+        </w:rPr>
+        <w:fldChar w:fldCharType="end"/>
+      </w:r>
+      <w:r>
+        <w:rPr>
+          <w:b/>
+          <w:bCs/>
+          <w:i/>
+          <w:iCs/>
+          <w:noProof/>
+          <w:color w:val="0F4761" w:themeColor="accent1" w:themeShade="BF"/>
+        </w:rPr>
+        <w:t xml:space="preserve"> </w:t>
+      </w:r>
+      <w:r>
+        <w:rPr>
+          <w:i/>
+          <w:iCs/>
+          <w:noProof/>
+          <w:color w:val="0F4761" w:themeColor="accent1" w:themeShade="BF"/>
+        </w:rPr>
+        <w:t>&gt;</w:t>
+      </w:r>
+      <w:r>
+        <w:rPr>
+          <w:b/>
+          <w:bCs/>
+          <w:noProof/>
+          <w:color w:val="0F4761" w:themeColor="accent1" w:themeShade="BF"/>
+        </w:rPr>
+        <w:t xml:space="preserve"> </w:t>
+      </w:r>
+      <w:r>
+        <w:rPr>
+          <w:b/>
+          <w:bCs/>
+          <w:noProof/>
+          <w:color w:val="0F4761" w:themeColor="accent1" w:themeShade="BF"/>
+        </w:rPr>
+        <w:fldChar w:fldCharType="begin"/>
+      </w:r>
+      <w:r>
+        <w:rPr>
+          <w:b/>
+          <w:bCs/>
+          <w:noProof/>
+          <w:color w:val="0F4761" w:themeColor="accent1" w:themeShade="BF"/>
+        </w:rPr>
+        <w:instrText xml:space="preserve"> MERGEFIELD Title </w:instrText>
+      </w:r>
+      <w:r>
+        <w:rPr>
+          <w:b/>
+          <w:bCs/>
+          <w:noProof/>
+          <w:color w:val="0F4761" w:themeColor="accent1" w:themeShade="BF"/>
+        </w:rPr>
+        <w:fldChar w:fldCharType="separate"/>
+      </w:r>
+      <w:r>
+        <w:rPr>
+          <w:b/>
+          <w:bCs/>
+          <w:noProof/>
+          <w:color w:val="0F4761" w:themeColor="accent1" w:themeShade="BF"/>
+        </w:rPr>
+        <w:t>Add / configure Laravel</w:t>
+      </w:r>
+      <w:r>
+        <w:rPr>
+          <w:b/>
+          <w:bCs/>
+          <w:noProof/>
+          <w:color w:val="0F4761" w:themeColor="accent1" w:themeShade="BF"/>
+        </w:rPr>
+        <w:fldChar w:fldCharType="end"/>
+      </w:r>
     </w:p>
     <w:p>
       <w:pPr>
@@ -61,7 +280,6 @@
     </w:p>
     <w:sectPr>
       <w:headerReference w:type="default" r:id="rId7"/>
-      <w:footerReference w:type="default" r:id="rId8"/>
       <w:pgSz w:w="11906" w:h="16838"/>
       <w:pgMar w:top="1701" w:right="1134" w:bottom="964" w:left="851" w:header="709" w:footer="709" w:gutter="0"/>
       <w:cols w:space="708"/>
@@ -94,24 +312,6 @@
     </w:p>
   </w:endnote>
 </w:endnotes>
-</file>
-
-<file path=word/footer1.xml><?xml version="1.0" encoding="utf-8"?>
-<w:ftr xmlns:wpc="http://schemas.microsoft.com/office/word/2010/wordprocessingCanvas" xmlns:cx="http://schemas.microsoft.com/office/drawing/2014/chartex" xmlns:cx1="http://schemas.microsoft.com/office/drawing/2015/9/8/chartex" xmlns:cx2="http://schemas.microsoft.com/office/drawing/2015/10/21/chartex" xmlns:cx3="http://schemas.microsoft.com/office/drawing/2016/5/9/chartex" xmlns:cx4="http://schemas.microsoft.com/office/drawing/2016/5/10/chartex" xmlns:cx5="http://schemas.microsoft.com/office/drawing/2016/5/11/chartex" xmlns:cx6="http://schemas.microsoft.com/office/drawing/2016/5/12/chartex" xmlns:cx7="http://schemas.microsoft.com/office/drawing/2016/5/13/chartex" xmlns:cx8="http://schemas.microsoft.com/office/drawing/2016/5/14/chartex" xmlns:mc="http://schemas.openxmlformats.org/markup-compatibility/2006" xmlns:aink="http://schemas.microsoft.com/office/drawing/2016/ink" xmlns:am3d="http://schemas.microsoft.com/office/drawing/2017/model3d" xmlns:o="urn:schemas-microsoft-com:office:office" xmlns:oel="http://schemas.microsoft.com/office/2019/extlst" xmlns:r="http://schemas.openxmlformats.org/officeDocument/2006/relationships" xmlns:m="http://schemas.openxmlformats.org/officeDocument/2006/math" xmlns:v="urn:schemas-microsoft-com:vml" xmlns:wp14="http://schemas.microsoft.com/office/word/2010/wordprocessingDrawing" xmlns:wp="http://schemas.openxmlformats.org/drawingml/2006/wordprocessingDrawing" xmlns:w10="urn:schemas-microsoft-com:office:word" xmlns:w="http://schemas.openxmlformats.org/wordprocessingml/2006/main" xmlns:w14="http://schemas.microsoft.com/office/word/2010/wordml" xmlns:w15="http://schemas.microsoft.com/office/word/2012/wordml" xmlns:w16cex="http://schemas.microsoft.com/office/word/2018/wordml/cex" xmlns:w16cid="http://schemas.microsoft.com/office/word/2016/wordml/cid" xmlns:w16="http://schemas.microsoft.com/office/word/2018/wordml" xmlns:w16du="http://schemas.microsoft.com/office/word/2023/wordml/word16du" xmlns:w16sdtdh="http://schemas.microsoft.com/office/word/2020/wordml/sdtdatahash" xmlns:w16sdtfl="http://schemas.microsoft.com/office/word/2024/wordml/sdtformatlock" xmlns:w16se="http://schemas.microsoft.com/office/word/2015/wordml/symex" xmlns:wpg="http://schemas.microsoft.com/office/word/2010/wordprocessingGroup" xmlns:wpi="http://schemas.microsoft.com/office/word/2010/wordprocessingInk" xmlns:wne="http://schemas.microsoft.com/office/word/2006/wordml" xmlns:wps="http://schemas.microsoft.com/office/word/2010/wordprocessingShape" mc:Ignorable="w14 w15 w16se w16cid w16 w16cex w16sdtdh w16sdtfl w16du wp14">
-  <w:p>
-    <w:pPr>
-      <w:pStyle w:val="Footer"/>
-    </w:pPr>
-    <w:r>
-      <w:t>V: 1.00.001</w:t>
-    </w:r>
-  </w:p>
-  <w:p>
-    <w:pPr>
-      <w:pStyle w:val="Footer"/>
-    </w:pPr>
-  </w:p>
-</w:ftr>
 </file>
 
 <file path=word/footnotes.xml><?xml version="1.0" encoding="utf-8"?>
@@ -194,16 +394,38 @@
   </w:p>
   <w:p>
     <w:pPr>
-      <w:pStyle w:val="Heading1"/>
+      <w:pStyle w:val="Footer"/>
       <w:rPr>
         <w:rStyle w:val="BookTitle"/>
+        <w:b w:val="0"/>
+        <w:bCs w:val="0"/>
+        <w:i w:val="0"/>
+        <w:iCs w:val="0"/>
+        <w:spacing w:val="0"/>
       </w:rPr>
     </w:pPr>
     <w:r>
       <w:rPr>
+        <w:rStyle w:val="Heading1Char"/>
+        <w:b/>
+        <w:bCs/>
+        <w:i/>
+        <w:iCs/>
+        <w:u w:val="single"/>
+      </w:rPr>
+      <w:t>Release Notes</w:t>
+    </w:r>
+    <w:r>
+      <w:rPr>
         <w:rStyle w:val="BookTitle"/>
       </w:rPr>
-      <w:t>Release Notes</w:t>
+      <w:br/>
+    </w:r>
+    <w:r>
+      <w:t>Version: 1.00.00</w:t>
+    </w:r>
+    <w:r>
+      <w:t>0</w:t>
     </w:r>
   </w:p>
   <w:p>
@@ -252,7 +474,25 @@
       <w:t>Project</w:t>
     </w:r>
     <w:r>
-      <w:t xml:space="preserve"> / Epic / Feature / Work Item </w:t>
+      <w:t xml:space="preserve"> </w:t>
+    </w:r>
+    <w:r>
+      <w:t>&gt;</w:t>
+    </w:r>
+    <w:r>
+      <w:t xml:space="preserve"> Epic </w:t>
+    </w:r>
+    <w:r>
+      <w:t>&gt;</w:t>
+    </w:r>
+    <w:r>
+      <w:t xml:space="preserve"> Feature </w:t>
+    </w:r>
+    <w:r>
+      <w:t>&gt;</w:t>
+    </w:r>
+    <w:r>
+      <w:t xml:space="preserve"> Work Item </w:t>
     </w:r>
     <w:r>
       <w:br/>
@@ -493,17 +733,17 @@
   <w:abstractNum w:abstractNumId="2" w15:restartNumberingAfterBreak="0">
     <w:nsid w:val="2E9A00E7"/>
     <w:multiLevelType w:val="hybridMultilevel"/>
-    <w:tmpl w:val="BEC04E84"/>
-    <w:lvl w:ilvl="0" w:tplc="08090001">
-      <w:start w:val="1"/>
-      <w:numFmt w:val="bullet"/>
-      <w:lvlText w:val=""/>
+    <w:tmpl w:val="AE9AE834"/>
+    <w:lvl w:ilvl="0" w:tplc="08090003">
+      <w:start w:val="1"/>
+      <w:numFmt w:val="bullet"/>
+      <w:lvlText w:val="o"/>
       <w:lvlJc w:val="left"/>
       <w:pPr>
         <w:ind w:left="720" w:hanging="360"/>
       </w:pPr>
       <w:rPr>
-        <w:rFonts w:ascii="Symbol" w:hAnsi="Symbol" w:hint="default"/>
+        <w:rFonts w:ascii="Courier New" w:hAnsi="Courier New" w:cs="Courier New" w:hint="default"/>
       </w:rPr>
     </w:lvl>
     <w:lvl w:ilvl="1" w:tplc="08090003" w:tentative="1">

</xml_diff>